<commit_message>
Correct main-survey dates to May-October 2025; align sampling description
Co-Authored-By: Claude Fable 5 <noreply@anthropic.com>
Claude-Session: https://claude.ai/code/session_019BJ4u1WYcsA14q2B552n7R
</commit_message>
<xml_diff>
--- a/projects/marvin-stress-trauma/manuscript.docx
+++ b/projects/marvin-stress-trauma/manuscript.docx
@@ -67,7 +67,7 @@
         <w:t>Methods:</w:t>
       </w:r>
       <w:r>
-        <w:t xml:space="preserve"> We analyzed data from 1,729 adults in six Nigerian states, five conflict-affected (Benue, Borno, Enugu, Rivers, Sokoto) and one non-conflict comparison state (Ogun), sampled through stratified multi-stage cluster sampling between January and March 2024. Outcomes were probable PTSD (PCL-5≥38), depression (PHQ-9≥10), and anxiety (GAD-7≥10), using instruments validated against clinician diagnosis in this population. We fit Poisson models with trauma exposure as a restricted cubic spline (0–12 event types), a trauma × stressor interaction, adjustment for age, gender, education, and state, and design-based variance estimation across 565 community clusters, and we estimated absolute prevalence differences at fixed trauma levels. Sensitivity analyses varied case thresholds and modeled continuous symptom scores.</w:t>
+        <w:t xml:space="preserve"> We analyzed data from 1,729 adults in six Nigerian states, five conflict-affected (Benue, Borno, Enugu, Rivers, Sokoto) and one non-conflict comparison state (Ogun), sampled through stratified multi-stage cluster sampling between May and October 2025. Outcomes were probable PTSD (PCL-5≥38), depression (PHQ-9≥10), and anxiety (GAD-7≥10), using instruments validated against clinician diagnosis in this population. We fit Poisson models with trauma exposure as a restricted cubic spline (0–12 event types), a trauma × stressor interaction, adjustment for age, gender, education, and state, and design-based variance estimation across 565 community clusters, and we estimated absolute prevalence differences at fixed trauma levels. Sensitivity analyses varied case thresholds and modeled continuous symptom scores.</w:t>
       </w:r>
     </w:p>
     <w:p>
@@ -173,7 +173,7 @@
         <w:spacing w:line="480" w:lineRule="auto"/>
       </w:pPr>
       <w:r>
-        <w:t>This analysis used data from the Mental Health and Resilience Following Violent Incidents in Nigeria (MaRVIN) project, a population-based cross-sectional survey conducted between January 15 and March 30, 2024. The study followed STROBE guidelines for observational research and WHO recommendations for mental health assessment in conflict settings.</w:t>
+        <w:t>This analysis used data from the Mental Health and Resilience Following Violent Incidents in Nigeria (MaRVIN) project, a population-based cross-sectional survey conducted between May and October 2025. The study followed STROBE guidelines for observational research and WHO recommendations for mental health assessment in conflict settings.</w:t>
       </w:r>
     </w:p>
     <w:p>
@@ -197,7 +197,7 @@
         <w:spacing w:line="480" w:lineRule="auto"/>
       </w:pPr>
       <w:r>
-        <w:t>Sampling proceeded in four stages within each state. Local Government Areas were randomly selected with probability proportional to size, stratified by security level using Armed Conflict Location and Event Data; Enumeration Areas were randomly selected from the National Population Commission's master frame, with oversampling of IDP-hosting areas; households were systematically selected with a random start and calculated interval; and one adult per household was selected by Kish grid. Eligibility required age 18 or older, residence in the study area for at least six months, capacity to consent, and fluency in Hausa, English, or a relevant local language. Persons with active psychosis, acute medical emergencies, or intoxication were excluded. [Confirm the Ogun sampling followed the same stages.]</w:t>
+        <w:t>Within each state, two Local Government Areas were selected, one urban and one rural, yielding 12 LGAs. Communities within LGAs were selected through a combination of purposive and random sampling, depending on state-specific logistics and security conditions, yielding 573 communities in total; households were selected by systematic sampling from a random start, and persons residing in IDP camps within sampled states were included through the same procedures. Eligibility required age 18 or older, residence in the community for at least six months, capacity to consent, and fluency in Hausa, English, or a relevant local language.</w:t>
       </w:r>
     </w:p>
     <w:p>

</xml_diff>